<commit_message>
DD-93 核查注：Superset catalog 行为与别名的关系，allow_multi_catalog 保持 false；LD-05 补充
Co-Authored-By: Claude Fable 5.1 <noreply@anthropic.com>
Claude-Session: https://claude.ai/code/session_01MzPePSHWkTUSpnMTsqY5pZ
</commit_message>
<xml_diff>
--- a/LD-05_展现层详细设计.docx
+++ b/LD-05_展现层详细设计.docx
@@ -167,6 +167,14 @@
       </w:pPr>
       <w:r>
         <w:t>2.1  自建外壳，Superset 只做查询引擎</w:t>
+      </w:r>
+    </w:p>
+    <w:p>
+      <w:pPr>
+        <w:pStyle w:val="Heading2"/>
+      </w:pPr>
+      <w:r>
+        <w:t>【2026-10-27 补充，DD-93】Superset 连接仓库经 pgBouncer 事务池 oss911_txn（别名，真实库为 oss911）。Superset 自 4.1 起把 PostgreSQL 的库当作 catalog：默认 catalog 取连接串库名，catalog 列表查 pg_database，切换 catalog 时改写连接串库名重连——与别名不一致。数据库连接 extra 的 allow_multi_catalog 必须保持 false（默认值），不开放多 catalog；安装后按实际版本经 pgBouncer 实测 SQL Lab 与数据集预览。</w:t>
       </w:r>
     </w:p>
     <w:p>

</xml_diff>